<commit_message>
until 8 & some document corrections
</commit_message>
<xml_diff>
--- a/src/week02/Lab2_Object_class_69.docx
+++ b/src/week02/Lab2_Object_class_69.docx
@@ -4,10 +4,11 @@
   <w:body>
     <w:p>
       <w:pPr>
-        <w:spacing w:after="240"/>
         <w:jc w:val="center"/>
         <w:rPr>
           <w:rFonts w:ascii="TH Sarabun New" w:hAnsi="TH Sarabun New" w:cs="TH Sarabun New"/>
+          <w:b/>
+          <w:bCs/>
           <w:sz w:val="44"/>
           <w:szCs w:val="44"/>
           <w:lang w:eastAsia="ja-JP"/>
@@ -16,6 +17,8 @@
       <w:r>
         <w:rPr>
           <w:rFonts w:ascii="TH Sarabun New" w:hAnsi="TH Sarabun New" w:cs="TH Sarabun New"/>
+          <w:b/>
+          <w:bCs/>
           <w:sz w:val="44"/>
           <w:szCs w:val="44"/>
           <w:cs/>
@@ -25,6 +28,8 @@
       <w:r>
         <w:rPr>
           <w:rFonts w:ascii="TH Sarabun New" w:hAnsi="TH Sarabun New" w:cs="TH Sarabun New"/>
+          <w:b/>
+          <w:bCs/>
           <w:sz w:val="44"/>
           <w:szCs w:val="44"/>
         </w:rPr>
@@ -33,6 +38,8 @@
       <w:r>
         <w:rPr>
           <w:rFonts w:ascii="TH Sarabun New" w:hAnsi="TH Sarabun New" w:cs="TH Sarabun New"/>
+          <w:b/>
+          <w:bCs/>
           <w:sz w:val="44"/>
           <w:szCs w:val="44"/>
           <w:cs/>
@@ -43,6 +50,8 @@
       <w:r>
         <w:rPr>
           <w:rFonts w:ascii="TH Sarabun New" w:hAnsi="TH Sarabun New" w:cs="TH Sarabun New"/>
+          <w:b/>
+          <w:bCs/>
           <w:sz w:val="44"/>
           <w:szCs w:val="44"/>
         </w:rPr>
@@ -51,6 +60,8 @@
       <w:r>
         <w:rPr>
           <w:rFonts w:ascii="TH Sarabun New" w:hAnsi="TH Sarabun New" w:cs="TH Sarabun New"/>
+          <w:b/>
+          <w:bCs/>
           <w:sz w:val="44"/>
           <w:szCs w:val="44"/>
           <w:lang w:eastAsia="ja-JP"/>
@@ -427,6 +438,8 @@
               <w:br/>
               <w:t xml:space="preserve">   }</w:t>
             </w:r>
+            <w:bookmarkStart w:id="0" w:name="_GoBack"/>
+            <w:bookmarkEnd w:id="0"/>
             <w:r>
               <w:rPr>
                 <w:rFonts w:ascii="Courier New" w:hAnsi="Courier New" w:cs="Courier New"/>
@@ -449,7 +462,7 @@
               <w:rPr>
                 <w:rFonts w:ascii="TH Sarabun New" w:hAnsi="TH Sarabun New" w:cs="TH Sarabun New"/>
                 <w:color w:val="1F3864" w:themeColor="accent5" w:themeShade="80"/>
-                <w:szCs w:val="24"/>
+                <w:sz w:val="28"/>
                 <w:cs/>
                 <w:lang w:val="en-GB" w:eastAsia="ja-JP"/>
               </w:rPr>
@@ -458,7 +471,7 @@
               <w:rPr>
                 <w:rFonts w:ascii="TH Sarabun New" w:hAnsi="TH Sarabun New" w:cs="TH Sarabun New"/>
                 <w:color w:val="1F3864" w:themeColor="accent5" w:themeShade="80"/>
-                <w:szCs w:val="24"/>
+                <w:sz w:val="28"/>
                 <w:lang w:eastAsia="ja-JP"/>
               </w:rPr>
               <w:t xml:space="preserve">class </w:t>
@@ -467,7 +480,7 @@
               <w:rPr>
                 <w:rFonts w:ascii="TH Sarabun New" w:hAnsi="TH Sarabun New" w:cs="TH Sarabun New"/>
                 <w:color w:val="1F3864" w:themeColor="accent5" w:themeShade="80"/>
-                <w:szCs w:val="24"/>
+                <w:sz w:val="28"/>
                 <w:cs/>
                 <w:lang w:eastAsia="ja-JP"/>
               </w:rPr>
@@ -477,7 +490,7 @@
               <w:rPr>
                 <w:rFonts w:ascii="TH Sarabun New" w:hAnsi="TH Sarabun New" w:cs="TH Sarabun New"/>
                 <w:color w:val="1F3864" w:themeColor="accent5" w:themeShade="80"/>
-                <w:szCs w:val="24"/>
+                <w:sz w:val="28"/>
                 <w:lang w:val="en-GB" w:eastAsia="ja-JP"/>
               </w:rPr>
               <w:t xml:space="preserve"> constructor </w:t>
@@ -486,7 +499,7 @@
               <w:rPr>
                 <w:rFonts w:ascii="TH Sarabun New" w:hAnsi="TH Sarabun New" w:cs="TH Sarabun New" w:hint="cs"/>
                 <w:color w:val="1F3864" w:themeColor="accent5" w:themeShade="80"/>
-                <w:szCs w:val="24"/>
+                <w:sz w:val="28"/>
                 <w:cs/>
                 <w:lang w:val="en-GB" w:eastAsia="ja-JP"/>
               </w:rPr>
@@ -782,7 +795,7 @@
               <w:rPr>
                 <w:rFonts w:ascii="TH Sarabun New" w:hAnsi="TH Sarabun New" w:cs="TH Sarabun New"/>
                 <w:color w:val="1F3864" w:themeColor="accent5" w:themeShade="80"/>
-                <w:szCs w:val="24"/>
+                <w:sz w:val="28"/>
                 <w:lang w:val="en-GB" w:eastAsia="ja-JP"/>
               </w:rPr>
             </w:pPr>
@@ -790,7 +803,7 @@
               <w:rPr>
                 <w:rFonts w:ascii="TH Sarabun New" w:hAnsi="TH Sarabun New" w:cs="TH Sarabun New"/>
                 <w:color w:val="1F3864" w:themeColor="accent5" w:themeShade="80"/>
-                <w:szCs w:val="24"/>
+                <w:sz w:val="28"/>
                 <w:lang w:eastAsia="ja-JP"/>
               </w:rPr>
               <w:t xml:space="preserve">class </w:t>
@@ -799,7 +812,7 @@
               <w:rPr>
                 <w:rFonts w:ascii="TH Sarabun New" w:hAnsi="TH Sarabun New" w:cs="TH Sarabun New"/>
                 <w:color w:val="1F3864" w:themeColor="accent5" w:themeShade="80"/>
-                <w:szCs w:val="24"/>
+                <w:sz w:val="28"/>
                 <w:cs/>
                 <w:lang w:eastAsia="ja-JP"/>
               </w:rPr>
@@ -809,7 +822,7 @@
               <w:rPr>
                 <w:rFonts w:ascii="TH Sarabun New" w:hAnsi="TH Sarabun New" w:cs="TH Sarabun New"/>
                 <w:color w:val="1F3864" w:themeColor="accent5" w:themeShade="80"/>
-                <w:szCs w:val="24"/>
+                <w:sz w:val="28"/>
                 <w:lang w:val="en-GB" w:eastAsia="ja-JP"/>
               </w:rPr>
               <w:t xml:space="preserve"> method x</w:t>
@@ -820,7 +833,7 @@
               <w:rPr>
                 <w:rFonts w:ascii="TH Sarabun New" w:hAnsi="TH Sarabun New" w:cs="TH Sarabun New"/>
                 <w:color w:val="1F3864" w:themeColor="accent5" w:themeShade="80"/>
-                <w:szCs w:val="24"/>
+                <w:sz w:val="28"/>
                 <w:cs/>
                 <w:lang w:val="en-GB" w:eastAsia="ja-JP"/>
               </w:rPr>
@@ -829,7 +842,7 @@
               <w:rPr>
                 <w:rFonts w:ascii="TH Sarabun New" w:hAnsi="TH Sarabun New" w:cs="TH Sarabun New" w:hint="cs"/>
                 <w:color w:val="1F3864" w:themeColor="accent5" w:themeShade="80"/>
-                <w:szCs w:val="24"/>
+                <w:sz w:val="28"/>
                 <w:cs/>
                 <w:lang w:eastAsia="ja-JP"/>
               </w:rPr>
@@ -839,7 +852,7 @@
               <w:rPr>
                 <w:rFonts w:ascii="TH Sarabun New" w:hAnsi="TH Sarabun New" w:cs="TH Sarabun New"/>
                 <w:color w:val="1F3864" w:themeColor="accent5" w:themeShade="80"/>
-                <w:szCs w:val="24"/>
+                <w:sz w:val="28"/>
                 <w:lang w:val="en-GB" w:eastAsia="ja-JP"/>
               </w:rPr>
               <w:t xml:space="preserve">method x </w:t>
@@ -848,7 +861,7 @@
               <w:rPr>
                 <w:rFonts w:ascii="TH Sarabun New" w:hAnsi="TH Sarabun New" w:cs="TH Sarabun New" w:hint="cs"/>
                 <w:color w:val="1F3864" w:themeColor="accent5" w:themeShade="80"/>
-                <w:szCs w:val="24"/>
+                <w:sz w:val="28"/>
                 <w:cs/>
                 <w:lang w:val="en-GB" w:eastAsia="ja-JP"/>
               </w:rPr>
@@ -858,7 +871,7 @@
               <w:rPr>
                 <w:rFonts w:ascii="TH Sarabun New" w:hAnsi="TH Sarabun New" w:cs="TH Sarabun New"/>
                 <w:color w:val="1F3864" w:themeColor="accent5" w:themeShade="80"/>
-                <w:szCs w:val="24"/>
+                <w:sz w:val="28"/>
                 <w:lang w:val="en-GB" w:eastAsia="ja-JP"/>
               </w:rPr>
               <w:t xml:space="preserve"> (</w:t>
@@ -867,7 +880,7 @@
               <w:rPr>
                 <w:rFonts w:ascii="TH Sarabun New" w:hAnsi="TH Sarabun New" w:cs="TH Sarabun New" w:hint="cs"/>
                 <w:color w:val="1F3864" w:themeColor="accent5" w:themeShade="80"/>
-                <w:szCs w:val="24"/>
+                <w:sz w:val="28"/>
                 <w:cs/>
                 <w:lang w:eastAsia="ja-JP"/>
               </w:rPr>
@@ -877,7 +890,7 @@
               <w:rPr>
                 <w:rFonts w:ascii="TH Sarabun New" w:hAnsi="TH Sarabun New" w:cs="TH Sarabun New"/>
                 <w:color w:val="1F3864" w:themeColor="accent5" w:themeShade="80"/>
-                <w:szCs w:val="24"/>
+                <w:sz w:val="28"/>
                 <w:lang w:val="en-GB" w:eastAsia="ja-JP"/>
               </w:rPr>
               <w:t xml:space="preserve">class </w:t>
@@ -887,7 +900,7 @@
               <w:rPr>
                 <w:rFonts w:ascii="TH Sarabun New" w:hAnsi="TH Sarabun New" w:cs="TH Sarabun New"/>
                 <w:color w:val="1F3864" w:themeColor="accent5" w:themeShade="80"/>
-                <w:szCs w:val="24"/>
+                <w:sz w:val="28"/>
                 <w:lang w:val="en-GB" w:eastAsia="ja-JP"/>
               </w:rPr>
               <w:t>ShowErrors</w:t>
@@ -897,7 +910,7 @@
               <w:rPr>
                 <w:rFonts w:ascii="TH Sarabun New" w:hAnsi="TH Sarabun New" w:cs="TH Sarabun New"/>
                 <w:color w:val="1F3864" w:themeColor="accent5" w:themeShade="80"/>
-                <w:szCs w:val="24"/>
+                <w:sz w:val="28"/>
                 <w:lang w:val="en-GB" w:eastAsia="ja-JP"/>
               </w:rPr>
               <w:t xml:space="preserve"> </w:t>
@@ -906,7 +919,7 @@
               <w:rPr>
                 <w:rFonts w:ascii="TH Sarabun New" w:hAnsi="TH Sarabun New" w:cs="TH Sarabun New" w:hint="cs"/>
                 <w:color w:val="1F3864" w:themeColor="accent5" w:themeShade="80"/>
-                <w:szCs w:val="24"/>
+                <w:sz w:val="28"/>
                 <w:cs/>
                 <w:lang w:val="en-GB" w:eastAsia="ja-JP"/>
               </w:rPr>
@@ -916,7 +929,7 @@
               <w:rPr>
                 <w:rFonts w:ascii="TH Sarabun New" w:hAnsi="TH Sarabun New" w:cs="TH Sarabun New"/>
                 <w:color w:val="1F3864" w:themeColor="accent5" w:themeShade="80"/>
-                <w:szCs w:val="24"/>
+                <w:sz w:val="28"/>
                 <w:lang w:val="en-GB" w:eastAsia="ja-JP"/>
               </w:rPr>
               <w:t xml:space="preserve">{} </w:t>
@@ -925,7 +938,7 @@
               <w:rPr>
                 <w:rFonts w:ascii="TH Sarabun New" w:hAnsi="TH Sarabun New" w:cs="TH Sarabun New" w:hint="cs"/>
                 <w:color w:val="1F3864" w:themeColor="accent5" w:themeShade="80"/>
-                <w:szCs w:val="24"/>
+                <w:sz w:val="28"/>
                 <w:cs/>
                 <w:lang w:val="en-GB" w:eastAsia="ja-JP"/>
               </w:rPr>
@@ -935,7 +948,7 @@
               <w:rPr>
                 <w:rFonts w:ascii="TH Sarabun New" w:hAnsi="TH Sarabun New" w:cs="TH Sarabun New"/>
                 <w:color w:val="1F3864" w:themeColor="accent5" w:themeShade="80"/>
-                <w:szCs w:val="24"/>
+                <w:sz w:val="28"/>
                 <w:lang w:val="en-GB" w:eastAsia="ja-JP"/>
               </w:rPr>
               <w:t>)</w:t>
@@ -1230,7 +1243,7 @@
               <w:rPr>
                 <w:rFonts w:ascii="TH Sarabun New" w:hAnsi="TH Sarabun New" w:cs="TH Sarabun New"/>
                 <w:color w:val="1F3864" w:themeColor="accent5" w:themeShade="80"/>
-                <w:szCs w:val="24"/>
+                <w:sz w:val="28"/>
                 <w:lang w:eastAsia="ja-JP"/>
               </w:rPr>
             </w:pPr>
@@ -1238,7 +1251,7 @@
               <w:rPr>
                 <w:rFonts w:ascii="TH Sarabun New" w:hAnsi="TH Sarabun New" w:cs="TH Sarabun New" w:hint="cs"/>
                 <w:color w:val="1F3864" w:themeColor="accent5" w:themeShade="80"/>
-                <w:szCs w:val="24"/>
+                <w:sz w:val="28"/>
                 <w:cs/>
                 <w:lang w:eastAsia="ja-JP"/>
               </w:rPr>
@@ -1248,7 +1261,7 @@
               <w:rPr>
                 <w:rFonts w:ascii="TH Sarabun New" w:hAnsi="TH Sarabun New" w:cs="TH Sarabun New"/>
                 <w:color w:val="1F3864" w:themeColor="accent5" w:themeShade="80"/>
-                <w:szCs w:val="24"/>
+                <w:sz w:val="28"/>
                 <w:cs/>
                 <w:lang w:eastAsia="ja-JP"/>
               </w:rPr>
@@ -1259,7 +1272,7 @@
               <w:rPr>
                 <w:rFonts w:ascii="TH Sarabun New" w:hAnsi="TH Sarabun New" w:cs="TH Sarabun New"/>
                 <w:color w:val="1F3864" w:themeColor="accent5" w:themeShade="80"/>
-                <w:szCs w:val="24"/>
+                <w:sz w:val="28"/>
                 <w:highlight w:val="green"/>
                 <w:lang w:eastAsia="ja-JP"/>
               </w:rPr>
@@ -1270,7 +1283,7 @@
               <w:rPr>
                 <w:rFonts w:ascii="TH Sarabun New" w:hAnsi="TH Sarabun New" w:cs="TH Sarabun New"/>
                 <w:color w:val="1F3864" w:themeColor="accent5" w:themeShade="80"/>
-                <w:szCs w:val="24"/>
+                <w:sz w:val="28"/>
                 <w:highlight w:val="green"/>
                 <w:lang w:eastAsia="ja-JP"/>
               </w:rPr>
@@ -1280,7 +1293,7 @@
               <w:rPr>
                 <w:rFonts w:ascii="TH Sarabun New" w:hAnsi="TH Sarabun New" w:cs="TH Sarabun New"/>
                 <w:color w:val="1F3864" w:themeColor="accent5" w:themeShade="80"/>
-                <w:szCs w:val="24"/>
+                <w:sz w:val="28"/>
                 <w:lang w:eastAsia="ja-JP"/>
               </w:rPr>
               <w:t xml:space="preserve"> </w:t>
@@ -1289,7 +1302,7 @@
               <w:rPr>
                 <w:rFonts w:ascii="TH Sarabun New" w:hAnsi="TH Sarabun New" w:cs="TH Sarabun New" w:hint="cs"/>
                 <w:color w:val="1F3864" w:themeColor="accent5" w:themeShade="80"/>
-                <w:szCs w:val="24"/>
+                <w:sz w:val="28"/>
                 <w:cs/>
                 <w:lang w:eastAsia="ja-JP"/>
               </w:rPr>
@@ -1299,7 +1312,7 @@
               <w:rPr>
                 <w:rFonts w:ascii="TH Sarabun New" w:hAnsi="TH Sarabun New" w:cs="TH Sarabun New"/>
                 <w:color w:val="1F3864" w:themeColor="accent5" w:themeShade="80"/>
-                <w:szCs w:val="24"/>
+                <w:sz w:val="28"/>
                 <w:cs/>
                 <w:lang w:eastAsia="ja-JP"/>
               </w:rPr>
@@ -1309,7 +1322,7 @@
               <w:rPr>
                 <w:rFonts w:ascii="TH Sarabun New" w:hAnsi="TH Sarabun New" w:cs="TH Sarabun New"/>
                 <w:color w:val="1F3864" w:themeColor="accent5" w:themeShade="80"/>
-                <w:szCs w:val="24"/>
+                <w:sz w:val="28"/>
                 <w:lang w:eastAsia="ja-JP"/>
               </w:rPr>
               <w:t xml:space="preserve">c </w:t>
@@ -1318,7 +1331,7 @@
               <w:rPr>
                 <w:rFonts w:ascii="TH Sarabun New" w:hAnsi="TH Sarabun New" w:cs="TH Sarabun New" w:hint="cs"/>
                 <w:color w:val="1F3864" w:themeColor="accent5" w:themeShade="80"/>
-                <w:szCs w:val="24"/>
+                <w:sz w:val="28"/>
                 <w:cs/>
                 <w:lang w:eastAsia="ja-JP"/>
               </w:rPr>
@@ -1328,7 +1341,7 @@
               <w:rPr>
                 <w:rFonts w:ascii="TH Sarabun New" w:hAnsi="TH Sarabun New" w:cs="TH Sarabun New"/>
                 <w:color w:val="1F3864" w:themeColor="accent5" w:themeShade="80"/>
-                <w:szCs w:val="24"/>
+                <w:sz w:val="28"/>
                 <w:cs/>
                 <w:lang w:eastAsia="ja-JP"/>
               </w:rPr>
@@ -1338,7 +1351,7 @@
               <w:rPr>
                 <w:rFonts w:ascii="TH Sarabun New" w:hAnsi="TH Sarabun New" w:cs="TH Sarabun New" w:hint="cs"/>
                 <w:color w:val="1F3864" w:themeColor="accent5" w:themeShade="80"/>
-                <w:szCs w:val="24"/>
+                <w:sz w:val="28"/>
                 <w:cs/>
                 <w:lang w:eastAsia="ja-JP"/>
               </w:rPr>
@@ -1348,7 +1361,7 @@
               <w:rPr>
                 <w:rFonts w:ascii="TH Sarabun New" w:hAnsi="TH Sarabun New" w:cs="TH Sarabun New"/>
                 <w:color w:val="1F3864" w:themeColor="accent5" w:themeShade="80"/>
-                <w:szCs w:val="24"/>
+                <w:sz w:val="28"/>
                 <w:cs/>
                 <w:lang w:eastAsia="ja-JP"/>
               </w:rPr>
@@ -1358,7 +1371,7 @@
               <w:rPr>
                 <w:rFonts w:ascii="TH Sarabun New" w:hAnsi="TH Sarabun New" w:cs="TH Sarabun New"/>
                 <w:color w:val="1F3864" w:themeColor="accent5" w:themeShade="80"/>
-                <w:szCs w:val="24"/>
+                <w:sz w:val="28"/>
                 <w:lang w:eastAsia="ja-JP"/>
               </w:rPr>
               <w:t xml:space="preserve">c </w:t>
@@ -1367,7 +1380,7 @@
               <w:rPr>
                 <w:rFonts w:ascii="TH Sarabun New" w:hAnsi="TH Sarabun New" w:cs="TH Sarabun New" w:hint="cs"/>
                 <w:color w:val="1F3864" w:themeColor="accent5" w:themeShade="80"/>
-                <w:szCs w:val="24"/>
+                <w:sz w:val="28"/>
                 <w:cs/>
                 <w:lang w:eastAsia="ja-JP"/>
               </w:rPr>
@@ -1377,7 +1390,7 @@
               <w:rPr>
                 <w:rFonts w:ascii="TH Sarabun New" w:hAnsi="TH Sarabun New" w:cs="TH Sarabun New"/>
                 <w:color w:val="1F3864" w:themeColor="accent5" w:themeShade="80"/>
-                <w:szCs w:val="24"/>
+                <w:sz w:val="28"/>
                 <w:cs/>
                 <w:lang w:eastAsia="ja-JP"/>
               </w:rPr>
@@ -1387,7 +1400,7 @@
               <w:rPr>
                 <w:rFonts w:ascii="TH Sarabun New" w:hAnsi="TH Sarabun New" w:cs="TH Sarabun New"/>
                 <w:color w:val="1F3864" w:themeColor="accent5" w:themeShade="80"/>
-                <w:szCs w:val="24"/>
+                <w:sz w:val="28"/>
                 <w:lang w:eastAsia="ja-JP"/>
               </w:rPr>
               <w:t>object</w:t>
@@ -1398,7 +1411,7 @@
               <w:rPr>
                 <w:rFonts w:ascii="TH Sarabun New" w:hAnsi="TH Sarabun New" w:cstheme="minorBidi"/>
                 <w:color w:val="1F3864" w:themeColor="accent5" w:themeShade="80"/>
-                <w:szCs w:val="24"/>
+                <w:sz w:val="28"/>
                 <w:lang w:val="en-GB" w:eastAsia="ja-JP"/>
               </w:rPr>
             </w:pPr>
@@ -1406,7 +1419,7 @@
               <w:rPr>
                 <w:rFonts w:ascii="TH Sarabun New" w:hAnsi="TH Sarabun New" w:cs="TH Sarabun New" w:hint="cs"/>
                 <w:color w:val="1F3864" w:themeColor="accent5" w:themeShade="80"/>
-                <w:szCs w:val="24"/>
+                <w:sz w:val="28"/>
                 <w:cs/>
                 <w:lang w:val="en-GB" w:eastAsia="ja-JP"/>
               </w:rPr>
@@ -1416,7 +1429,7 @@
               <w:rPr>
                 <w:rFonts w:ascii="TH Sarabun New" w:hAnsi="TH Sarabun New" w:cs="TH Sarabun New"/>
                 <w:color w:val="1F3864" w:themeColor="accent5" w:themeShade="80"/>
-                <w:szCs w:val="24"/>
+                <w:sz w:val="28"/>
                 <w:highlight w:val="cyan"/>
                 <w:lang w:val="en-GB" w:eastAsia="ja-JP"/>
               </w:rPr>
@@ -1796,7 +1809,7 @@
               <w:rPr>
                 <w:rFonts w:ascii="TH Sarabun New" w:hAnsi="TH Sarabun New" w:cs="TH Sarabun New"/>
                 <w:color w:val="1F3864" w:themeColor="accent5" w:themeShade="80"/>
-                <w:szCs w:val="24"/>
+                <w:sz w:val="28"/>
                 <w:lang w:val="en-GB" w:eastAsia="ja-JP"/>
               </w:rPr>
             </w:pPr>
@@ -1804,7 +1817,7 @@
               <w:rPr>
                 <w:rFonts w:ascii="TH Sarabun New" w:hAnsi="TH Sarabun New" w:cs="TH Sarabun New"/>
                 <w:color w:val="1F3864" w:themeColor="accent5" w:themeShade="80"/>
-                <w:szCs w:val="24"/>
+                <w:sz w:val="28"/>
                 <w:lang w:eastAsia="ja-JP"/>
               </w:rPr>
               <w:t>class</w:t>
@@ -1813,7 +1826,7 @@
               <w:rPr>
                 <w:rFonts w:ascii="TH Sarabun New" w:hAnsi="TH Sarabun New" w:cs="TH Sarabun New" w:hint="cs"/>
                 <w:color w:val="1F3864" w:themeColor="accent5" w:themeShade="80"/>
-                <w:szCs w:val="24"/>
+                <w:sz w:val="28"/>
                 <w:cs/>
                 <w:lang w:eastAsia="ja-JP"/>
               </w:rPr>
@@ -1823,7 +1836,7 @@
               <w:rPr>
                 <w:rFonts w:ascii="TH Sarabun New" w:hAnsi="TH Sarabun New" w:cs="TH Sarabun New"/>
                 <w:color w:val="1F3864" w:themeColor="accent5" w:themeShade="80"/>
-                <w:szCs w:val="24"/>
+                <w:sz w:val="28"/>
                 <w:lang w:eastAsia="ja-JP"/>
               </w:rPr>
               <w:t xml:space="preserve">C </w:t>
@@ -1832,7 +1845,7 @@
               <w:rPr>
                 <w:rFonts w:ascii="TH Sarabun New" w:hAnsi="TH Sarabun New" w:cs="TH Sarabun New"/>
                 <w:color w:val="1F3864" w:themeColor="accent5" w:themeShade="80"/>
-                <w:szCs w:val="24"/>
+                <w:sz w:val="28"/>
                 <w:cs/>
                 <w:lang w:eastAsia="ja-JP"/>
               </w:rPr>
@@ -1842,7 +1855,7 @@
               <w:rPr>
                 <w:rFonts w:ascii="TH Sarabun New" w:hAnsi="TH Sarabun New" w:cs="TH Sarabun New"/>
                 <w:color w:val="1F3864" w:themeColor="accent5" w:themeShade="80"/>
-                <w:szCs w:val="24"/>
+                <w:sz w:val="28"/>
                 <w:lang w:val="en-GB" w:eastAsia="ja-JP"/>
               </w:rPr>
               <w:t xml:space="preserve"> constructor</w:t>
@@ -1853,7 +1866,7 @@
               <w:rPr>
                 <w:rFonts w:ascii="TH Sarabun New" w:hAnsi="TH Sarabun New" w:cs="TH Sarabun New"/>
                 <w:color w:val="1F3864" w:themeColor="accent5" w:themeShade="80"/>
-                <w:szCs w:val="24"/>
+                <w:sz w:val="28"/>
                 <w:lang w:val="en-GB" w:eastAsia="ja-JP"/>
               </w:rPr>
             </w:pPr>
@@ -1861,7 +1874,7 @@
               <w:rPr>
                 <w:rFonts w:ascii="TH Sarabun New" w:hAnsi="TH Sarabun New" w:cs="TH Sarabun New" w:hint="cs"/>
                 <w:color w:val="1F3864" w:themeColor="accent5" w:themeShade="80"/>
-                <w:szCs w:val="24"/>
+                <w:sz w:val="28"/>
                 <w:cs/>
                 <w:lang w:eastAsia="ja-JP"/>
               </w:rPr>
@@ -1871,7 +1884,7 @@
               <w:rPr>
                 <w:rFonts w:ascii="TH Sarabun New" w:hAnsi="TH Sarabun New" w:cs="TH Sarabun New"/>
                 <w:color w:val="1F3864" w:themeColor="accent5" w:themeShade="80"/>
-                <w:szCs w:val="24"/>
+                <w:sz w:val="28"/>
                 <w:lang w:eastAsia="ja-JP"/>
               </w:rPr>
               <w:t xml:space="preserve"> print </w:t>
@@ -1880,7 +1893,7 @@
               <w:rPr>
                 <w:rFonts w:ascii="TH Sarabun New" w:hAnsi="TH Sarabun New" w:cs="TH Sarabun New" w:hint="cs"/>
                 <w:color w:val="1F3864" w:themeColor="accent5" w:themeShade="80"/>
-                <w:szCs w:val="24"/>
+                <w:sz w:val="28"/>
                 <w:cs/>
                 <w:lang w:eastAsia="ja-JP"/>
               </w:rPr>
@@ -1890,7 +1903,7 @@
               <w:rPr>
                 <w:rFonts w:ascii="TH Sarabun New" w:hAnsi="TH Sarabun New" w:cs="TH Sarabun New"/>
                 <w:color w:val="1F3864" w:themeColor="accent5" w:themeShade="80"/>
-                <w:szCs w:val="24"/>
+                <w:sz w:val="28"/>
                 <w:lang w:val="en-GB" w:eastAsia="ja-JP"/>
               </w:rPr>
               <w:t xml:space="preserve">constructor </w:t>
@@ -1899,7 +1912,7 @@
               <w:rPr>
                 <w:rFonts w:ascii="TH Sarabun New" w:hAnsi="TH Sarabun New" w:cs="TH Sarabun New" w:hint="cs"/>
                 <w:color w:val="1F3864" w:themeColor="accent5" w:themeShade="80"/>
-                <w:szCs w:val="24"/>
+                <w:sz w:val="28"/>
                 <w:cs/>
                 <w:lang w:val="en-GB" w:eastAsia="ja-JP"/>
               </w:rPr>
@@ -1909,7 +1922,7 @@
               <w:rPr>
                 <w:rFonts w:ascii="TH Sarabun New" w:hAnsi="TH Sarabun New" w:cs="TH Sarabun New"/>
                 <w:color w:val="1F3864" w:themeColor="accent5" w:themeShade="80"/>
-                <w:szCs w:val="24"/>
+                <w:sz w:val="28"/>
                 <w:lang w:val="en-GB" w:eastAsia="ja-JP"/>
               </w:rPr>
               <w:t>new</w:t>
@@ -2037,8 +2050,8 @@
             <w:pPr>
               <w:rPr>
                 <w:rFonts w:ascii="Courier New" w:hAnsi="Courier New" w:cs="Courier New"/>
-                <w:sz w:val="18"/>
-                <w:szCs w:val="18"/>
+                <w:sz w:val="20"/>
+                <w:szCs w:val="20"/>
                 <w:lang w:eastAsia="ja-JP"/>
               </w:rPr>
             </w:pPr>
@@ -2046,8 +2059,8 @@
               <w:rPr>
                 <w:rFonts w:ascii="Courier New" w:hAnsi="Courier New" w:cs="Courier New"/>
                 <w:color w:val="941EDF"/>
-                <w:sz w:val="18"/>
-                <w:szCs w:val="18"/>
+                <w:sz w:val="20"/>
+                <w:szCs w:val="20"/>
               </w:rPr>
               <w:t>public</w:t>
             </w:r>
@@ -2055,8 +2068,8 @@
               <w:rPr>
                 <w:rFonts w:ascii="Courier New" w:hAnsi="Courier New" w:cs="Courier New"/>
                 <w:color w:val="000000"/>
-                <w:sz w:val="18"/>
-                <w:szCs w:val="18"/>
+                <w:sz w:val="20"/>
+                <w:szCs w:val="20"/>
               </w:rPr>
               <w:t xml:space="preserve"> </w:t>
             </w:r>
@@ -2064,8 +2077,8 @@
               <w:rPr>
                 <w:rFonts w:ascii="Courier New" w:hAnsi="Courier New" w:cs="Courier New"/>
                 <w:color w:val="941EDF"/>
-                <w:sz w:val="18"/>
-                <w:szCs w:val="18"/>
+                <w:sz w:val="20"/>
+                <w:szCs w:val="20"/>
               </w:rPr>
               <w:t>class</w:t>
             </w:r>
@@ -2073,8 +2086,8 @@
               <w:rPr>
                 <w:rFonts w:ascii="Courier New" w:hAnsi="Courier New" w:cs="Courier New"/>
                 <w:color w:val="000000"/>
-                <w:sz w:val="18"/>
-                <w:szCs w:val="18"/>
+                <w:sz w:val="20"/>
+                <w:szCs w:val="20"/>
               </w:rPr>
               <w:t xml:space="preserve"> Test{</w:t>
             </w:r>
@@ -2082,8 +2095,8 @@
               <w:rPr>
                 <w:rFonts w:ascii="Courier New" w:hAnsi="Courier New" w:cs="Courier New"/>
                 <w:color w:val="000000"/>
-                <w:sz w:val="18"/>
-                <w:szCs w:val="18"/>
+                <w:sz w:val="20"/>
+                <w:szCs w:val="20"/>
               </w:rPr>
               <w:br/>
               <w:t xml:space="preserve">   </w:t>
@@ -2092,8 +2105,8 @@
               <w:rPr>
                 <w:rFonts w:ascii="Courier New" w:hAnsi="Courier New" w:cs="Courier New"/>
                 <w:color w:val="941EDF"/>
-                <w:sz w:val="18"/>
-                <w:szCs w:val="18"/>
+                <w:sz w:val="20"/>
+                <w:szCs w:val="20"/>
               </w:rPr>
               <w:t>public</w:t>
             </w:r>
@@ -2101,8 +2114,8 @@
               <w:rPr>
                 <w:rFonts w:ascii="Courier New" w:hAnsi="Courier New" w:cs="Courier New"/>
                 <w:color w:val="000000"/>
-                <w:sz w:val="18"/>
-                <w:szCs w:val="18"/>
+                <w:sz w:val="20"/>
+                <w:szCs w:val="20"/>
               </w:rPr>
               <w:t xml:space="preserve"> </w:t>
             </w:r>
@@ -2110,8 +2123,8 @@
               <w:rPr>
                 <w:rFonts w:ascii="Courier New" w:hAnsi="Courier New" w:cs="Courier New"/>
                 <w:color w:val="941EDF"/>
-                <w:sz w:val="18"/>
-                <w:szCs w:val="18"/>
+                <w:sz w:val="20"/>
+                <w:szCs w:val="20"/>
               </w:rPr>
               <w:t>static</w:t>
             </w:r>
@@ -2119,8 +2132,8 @@
               <w:rPr>
                 <w:rFonts w:ascii="Courier New" w:hAnsi="Courier New" w:cs="Courier New"/>
                 <w:color w:val="000000"/>
-                <w:sz w:val="18"/>
-                <w:szCs w:val="18"/>
+                <w:sz w:val="20"/>
+                <w:szCs w:val="20"/>
               </w:rPr>
               <w:t xml:space="preserve"> </w:t>
             </w:r>
@@ -2128,8 +2141,8 @@
               <w:rPr>
                 <w:rFonts w:ascii="Courier New" w:hAnsi="Courier New" w:cs="Courier New"/>
                 <w:color w:val="941EDF"/>
-                <w:sz w:val="18"/>
-                <w:szCs w:val="18"/>
+                <w:sz w:val="20"/>
+                <w:szCs w:val="20"/>
               </w:rPr>
               <w:t>void</w:t>
             </w:r>
@@ -2137,8 +2150,8 @@
               <w:rPr>
                 <w:rFonts w:ascii="Courier New" w:hAnsi="Courier New" w:cs="Courier New"/>
                 <w:color w:val="000000"/>
-                <w:sz w:val="18"/>
-                <w:szCs w:val="18"/>
+                <w:sz w:val="20"/>
+                <w:szCs w:val="20"/>
               </w:rPr>
               <w:t xml:space="preserve"> main(String[] </w:t>
             </w:r>
@@ -2147,8 +2160,8 @@
               <w:rPr>
                 <w:rFonts w:ascii="Courier New" w:hAnsi="Courier New" w:cs="Courier New"/>
                 <w:color w:val="000000"/>
-                <w:sz w:val="18"/>
-                <w:szCs w:val="18"/>
+                <w:sz w:val="20"/>
+                <w:szCs w:val="20"/>
               </w:rPr>
               <w:t>args</w:t>
             </w:r>
@@ -2157,8 +2170,8 @@
               <w:rPr>
                 <w:rFonts w:ascii="Courier New" w:hAnsi="Courier New" w:cs="Courier New"/>
                 <w:color w:val="000000"/>
-                <w:sz w:val="18"/>
-                <w:szCs w:val="18"/>
+                <w:sz w:val="20"/>
+                <w:szCs w:val="20"/>
               </w:rPr>
               <w:t>){</w:t>
             </w:r>
@@ -2166,8 +2179,8 @@
               <w:rPr>
                 <w:rFonts w:ascii="Courier New" w:hAnsi="Courier New" w:cs="Courier New"/>
                 <w:color w:val="000000"/>
-                <w:sz w:val="18"/>
-                <w:szCs w:val="18"/>
+                <w:sz w:val="20"/>
+                <w:szCs w:val="20"/>
               </w:rPr>
               <w:br/>
               <w:t xml:space="preserve">      Count </w:t>
@@ -2177,8 +2190,8 @@
               <w:rPr>
                 <w:rFonts w:ascii="Courier New" w:hAnsi="Courier New" w:cs="Courier New"/>
                 <w:color w:val="000000"/>
-                <w:sz w:val="18"/>
-                <w:szCs w:val="18"/>
+                <w:sz w:val="20"/>
+                <w:szCs w:val="20"/>
               </w:rPr>
               <w:t>myCount</w:t>
             </w:r>
@@ -2187,8 +2200,8 @@
               <w:rPr>
                 <w:rFonts w:ascii="Courier New" w:hAnsi="Courier New" w:cs="Courier New"/>
                 <w:color w:val="000000"/>
-                <w:sz w:val="18"/>
-                <w:szCs w:val="18"/>
+                <w:sz w:val="20"/>
+                <w:szCs w:val="20"/>
               </w:rPr>
               <w:t xml:space="preserve"> = </w:t>
             </w:r>
@@ -2196,8 +2209,8 @@
               <w:rPr>
                 <w:rFonts w:ascii="Courier New" w:hAnsi="Courier New" w:cs="Courier New"/>
                 <w:color w:val="941EDF"/>
-                <w:sz w:val="18"/>
-                <w:szCs w:val="18"/>
+                <w:sz w:val="20"/>
+                <w:szCs w:val="20"/>
               </w:rPr>
               <w:t>new</w:t>
             </w:r>
@@ -2205,8 +2218,8 @@
               <w:rPr>
                 <w:rFonts w:ascii="Courier New" w:hAnsi="Courier New" w:cs="Courier New"/>
                 <w:color w:val="000000"/>
-                <w:sz w:val="18"/>
-                <w:szCs w:val="18"/>
+                <w:sz w:val="20"/>
+                <w:szCs w:val="20"/>
               </w:rPr>
               <w:t xml:space="preserve"> Count();</w:t>
             </w:r>
@@ -2214,8 +2227,8 @@
               <w:rPr>
                 <w:rFonts w:ascii="Courier New" w:hAnsi="Courier New" w:cs="Courier New"/>
                 <w:color w:val="000000"/>
-                <w:sz w:val="18"/>
-                <w:szCs w:val="18"/>
+                <w:sz w:val="20"/>
+                <w:szCs w:val="20"/>
               </w:rPr>
               <w:br/>
               <w:t xml:space="preserve">      </w:t>
@@ -2225,8 +2238,8 @@
               <w:rPr>
                 <w:rFonts w:ascii="Courier New" w:hAnsi="Courier New" w:cs="Courier New"/>
                 <w:color w:val="941EDF"/>
-                <w:sz w:val="18"/>
-                <w:szCs w:val="18"/>
+                <w:sz w:val="20"/>
+                <w:szCs w:val="20"/>
               </w:rPr>
               <w:t>int</w:t>
             </w:r>
@@ -2235,8 +2248,8 @@
               <w:rPr>
                 <w:rFonts w:ascii="Courier New" w:hAnsi="Courier New" w:cs="Courier New"/>
                 <w:color w:val="000000"/>
-                <w:sz w:val="18"/>
-                <w:szCs w:val="18"/>
+                <w:sz w:val="20"/>
+                <w:szCs w:val="20"/>
               </w:rPr>
               <w:t xml:space="preserve"> times=0;</w:t>
             </w:r>
@@ -2244,8 +2257,8 @@
               <w:rPr>
                 <w:rFonts w:ascii="Courier New" w:hAnsi="Courier New" w:cs="Courier New"/>
                 <w:color w:val="000000"/>
-                <w:sz w:val="18"/>
-                <w:szCs w:val="18"/>
+                <w:sz w:val="20"/>
+                <w:szCs w:val="20"/>
               </w:rPr>
               <w:br/>
               <w:t xml:space="preserve">      </w:t>
@@ -2254,8 +2267,8 @@
               <w:rPr>
                 <w:rFonts w:ascii="Courier New" w:hAnsi="Courier New" w:cs="Courier New"/>
                 <w:color w:val="941EDF"/>
-                <w:sz w:val="18"/>
-                <w:szCs w:val="18"/>
+                <w:sz w:val="20"/>
+                <w:szCs w:val="20"/>
               </w:rPr>
               <w:t>for</w:t>
             </w:r>
@@ -2263,8 +2276,8 @@
               <w:rPr>
                 <w:rFonts w:ascii="Courier New" w:hAnsi="Courier New" w:cs="Courier New"/>
                 <w:color w:val="000000"/>
-                <w:sz w:val="18"/>
-                <w:szCs w:val="18"/>
+                <w:sz w:val="20"/>
+                <w:szCs w:val="20"/>
               </w:rPr>
               <w:t xml:space="preserve"> (</w:t>
             </w:r>
@@ -2273,8 +2286,8 @@
               <w:rPr>
                 <w:rFonts w:ascii="Courier New" w:hAnsi="Courier New" w:cs="Courier New"/>
                 <w:color w:val="941EDF"/>
-                <w:sz w:val="18"/>
-                <w:szCs w:val="18"/>
+                <w:sz w:val="20"/>
+                <w:szCs w:val="20"/>
               </w:rPr>
               <w:t>int</w:t>
             </w:r>
@@ -2283,8 +2296,8 @@
               <w:rPr>
                 <w:rFonts w:ascii="Courier New" w:hAnsi="Courier New" w:cs="Courier New"/>
                 <w:color w:val="000000"/>
-                <w:sz w:val="18"/>
-                <w:szCs w:val="18"/>
+                <w:sz w:val="20"/>
+                <w:szCs w:val="20"/>
               </w:rPr>
               <w:t xml:space="preserve"> </w:t>
             </w:r>
@@ -2293,8 +2306,8 @@
               <w:rPr>
                 <w:rFonts w:ascii="Courier New" w:hAnsi="Courier New" w:cs="Courier New"/>
                 <w:color w:val="000000"/>
-                <w:sz w:val="18"/>
-                <w:szCs w:val="18"/>
+                <w:sz w:val="20"/>
+                <w:szCs w:val="20"/>
               </w:rPr>
               <w:t>i</w:t>
             </w:r>
@@ -2303,8 +2316,8 @@
               <w:rPr>
                 <w:rFonts w:ascii="Courier New" w:hAnsi="Courier New" w:cs="Courier New"/>
                 <w:color w:val="000000"/>
-                <w:sz w:val="18"/>
-                <w:szCs w:val="18"/>
+                <w:sz w:val="20"/>
+                <w:szCs w:val="20"/>
               </w:rPr>
               <w:t xml:space="preserve">=0; </w:t>
             </w:r>
@@ -2313,8 +2326,8 @@
               <w:rPr>
                 <w:rFonts w:ascii="Courier New" w:hAnsi="Courier New" w:cs="Courier New"/>
                 <w:color w:val="000000"/>
-                <w:sz w:val="18"/>
-                <w:szCs w:val="18"/>
+                <w:sz w:val="20"/>
+                <w:szCs w:val="20"/>
               </w:rPr>
               <w:t>i</w:t>
             </w:r>
@@ -2323,8 +2336,8 @@
               <w:rPr>
                 <w:rFonts w:ascii="Courier New" w:hAnsi="Courier New" w:cs="Courier New"/>
                 <w:color w:val="000000"/>
-                <w:sz w:val="18"/>
-                <w:szCs w:val="18"/>
+                <w:sz w:val="20"/>
+                <w:szCs w:val="20"/>
               </w:rPr>
               <w:t>&lt;100 ;</w:t>
             </w:r>
@@ -2333,8 +2346,8 @@
               <w:rPr>
                 <w:rFonts w:ascii="Courier New" w:hAnsi="Courier New" w:cs="Courier New"/>
                 <w:color w:val="000000"/>
-                <w:sz w:val="18"/>
-                <w:szCs w:val="18"/>
+                <w:sz w:val="20"/>
+                <w:szCs w:val="20"/>
               </w:rPr>
               <w:t>i</w:t>
             </w:r>
@@ -2343,8 +2356,8 @@
               <w:rPr>
                 <w:rFonts w:ascii="Courier New" w:hAnsi="Courier New" w:cs="Courier New"/>
                 <w:color w:val="000000"/>
-                <w:sz w:val="18"/>
-                <w:szCs w:val="18"/>
+                <w:sz w:val="20"/>
+                <w:szCs w:val="20"/>
               </w:rPr>
               <w:t>++)</w:t>
             </w:r>
@@ -2352,8 +2365,8 @@
               <w:rPr>
                 <w:rFonts w:ascii="Courier New" w:hAnsi="Courier New" w:cs="Courier New"/>
                 <w:color w:val="000000"/>
-                <w:sz w:val="18"/>
-                <w:szCs w:val="18"/>
+                <w:sz w:val="20"/>
+                <w:szCs w:val="20"/>
               </w:rPr>
               <w:br/>
               <w:t xml:space="preserve">         increment(</w:t>
@@ -2363,8 +2376,8 @@
               <w:rPr>
                 <w:rFonts w:ascii="Courier New" w:hAnsi="Courier New" w:cs="Courier New"/>
                 <w:color w:val="000000"/>
-                <w:sz w:val="18"/>
-                <w:szCs w:val="18"/>
+                <w:sz w:val="20"/>
+                <w:szCs w:val="20"/>
               </w:rPr>
               <w:t>myCount</w:t>
             </w:r>
@@ -2373,8 +2386,8 @@
               <w:rPr>
                 <w:rFonts w:ascii="Courier New" w:hAnsi="Courier New" w:cs="Courier New"/>
                 <w:color w:val="000000"/>
-                <w:sz w:val="18"/>
-                <w:szCs w:val="18"/>
+                <w:sz w:val="20"/>
+                <w:szCs w:val="20"/>
               </w:rPr>
               <w:t>, times);</w:t>
             </w:r>
@@ -2382,8 +2395,8 @@
               <w:rPr>
                 <w:rFonts w:ascii="Courier New" w:hAnsi="Courier New" w:cs="Courier New"/>
                 <w:color w:val="000000"/>
-                <w:sz w:val="18"/>
-                <w:szCs w:val="18"/>
+                <w:sz w:val="20"/>
+                <w:szCs w:val="20"/>
               </w:rPr>
               <w:br/>
               <w:t xml:space="preserve">      </w:t>
@@ -2393,8 +2406,8 @@
               <w:rPr>
                 <w:rFonts w:ascii="Courier New" w:hAnsi="Courier New" w:cs="Courier New"/>
                 <w:color w:val="000000"/>
-                <w:sz w:val="18"/>
-                <w:szCs w:val="18"/>
+                <w:sz w:val="20"/>
+                <w:szCs w:val="20"/>
               </w:rPr>
               <w:t>System.out.println</w:t>
             </w:r>
@@ -2403,8 +2416,8 @@
               <w:rPr>
                 <w:rFonts w:ascii="Courier New" w:hAnsi="Courier New" w:cs="Courier New"/>
                 <w:color w:val="000000"/>
-                <w:sz w:val="18"/>
-                <w:szCs w:val="18"/>
+                <w:sz w:val="20"/>
+                <w:szCs w:val="20"/>
               </w:rPr>
               <w:t>(</w:t>
             </w:r>
@@ -2412,8 +2425,8 @@
               <w:rPr>
                 <w:rFonts w:ascii="Courier New" w:hAnsi="Courier New" w:cs="Courier New"/>
                 <w:color w:val="00CB00"/>
-                <w:sz w:val="18"/>
-                <w:szCs w:val="18"/>
+                <w:sz w:val="20"/>
+                <w:szCs w:val="20"/>
               </w:rPr>
               <w:t>"count is "</w:t>
             </w:r>
@@ -2421,8 +2434,8 @@
               <w:rPr>
                 <w:rFonts w:ascii="Courier New" w:hAnsi="Courier New" w:cs="Courier New"/>
                 <w:color w:val="000000"/>
-                <w:sz w:val="18"/>
-                <w:szCs w:val="18"/>
+                <w:sz w:val="20"/>
+                <w:szCs w:val="20"/>
               </w:rPr>
               <w:t>+</w:t>
             </w:r>
@@ -2431,8 +2444,8 @@
               <w:rPr>
                 <w:rFonts w:ascii="Courier New" w:hAnsi="Courier New" w:cs="Courier New"/>
                 <w:color w:val="000000"/>
-                <w:sz w:val="18"/>
-                <w:szCs w:val="18"/>
+                <w:sz w:val="20"/>
+                <w:szCs w:val="20"/>
               </w:rPr>
               <w:t>myCount.count</w:t>
             </w:r>
@@ -2441,8 +2454,8 @@
               <w:rPr>
                 <w:rFonts w:ascii="Courier New" w:hAnsi="Courier New" w:cs="Courier New"/>
                 <w:color w:val="000000"/>
-                <w:sz w:val="18"/>
-                <w:szCs w:val="18"/>
+                <w:sz w:val="20"/>
+                <w:szCs w:val="20"/>
               </w:rPr>
               <w:t>);</w:t>
             </w:r>
@@ -2450,8 +2463,8 @@
               <w:rPr>
                 <w:rFonts w:ascii="Courier New" w:hAnsi="Courier New" w:cs="Courier New"/>
                 <w:color w:val="000000"/>
-                <w:sz w:val="18"/>
-                <w:szCs w:val="18"/>
+                <w:sz w:val="20"/>
+                <w:szCs w:val="20"/>
               </w:rPr>
               <w:br/>
               <w:t xml:space="preserve">      </w:t>
@@ -2461,8 +2474,8 @@
               <w:rPr>
                 <w:rFonts w:ascii="Courier New" w:hAnsi="Courier New" w:cs="Courier New"/>
                 <w:color w:val="000000"/>
-                <w:sz w:val="18"/>
-                <w:szCs w:val="18"/>
+                <w:sz w:val="20"/>
+                <w:szCs w:val="20"/>
               </w:rPr>
               <w:t>System.out.println</w:t>
             </w:r>
@@ -2471,8 +2484,8 @@
               <w:rPr>
                 <w:rFonts w:ascii="Courier New" w:hAnsi="Courier New" w:cs="Courier New"/>
                 <w:color w:val="000000"/>
-                <w:sz w:val="18"/>
-                <w:szCs w:val="18"/>
+                <w:sz w:val="20"/>
+                <w:szCs w:val="20"/>
               </w:rPr>
               <w:t>(</w:t>
             </w:r>
@@ -2480,8 +2493,8 @@
               <w:rPr>
                 <w:rFonts w:ascii="Courier New" w:hAnsi="Courier New" w:cs="Courier New"/>
                 <w:color w:val="00CB00"/>
-                <w:sz w:val="18"/>
-                <w:szCs w:val="18"/>
+                <w:sz w:val="20"/>
+                <w:szCs w:val="20"/>
               </w:rPr>
               <w:t>"times is "</w:t>
             </w:r>
@@ -2489,8 +2502,8 @@
               <w:rPr>
                 <w:rFonts w:ascii="Courier New" w:hAnsi="Courier New" w:cs="Courier New"/>
                 <w:color w:val="000000"/>
-                <w:sz w:val="18"/>
-                <w:szCs w:val="18"/>
+                <w:sz w:val="20"/>
+                <w:szCs w:val="20"/>
               </w:rPr>
               <w:t xml:space="preserve">+times);    </w:t>
             </w:r>
@@ -2498,8 +2511,8 @@
               <w:rPr>
                 <w:rFonts w:ascii="Courier New" w:hAnsi="Courier New" w:cs="Courier New"/>
                 <w:color w:val="000000"/>
-                <w:sz w:val="18"/>
-                <w:szCs w:val="18"/>
+                <w:sz w:val="20"/>
+                <w:szCs w:val="20"/>
               </w:rPr>
               <w:br/>
               <w:t xml:space="preserve">   }</w:t>
@@ -2508,8 +2521,8 @@
               <w:rPr>
                 <w:rFonts w:ascii="Courier New" w:hAnsi="Courier New" w:cs="Courier New"/>
                 <w:color w:val="000000"/>
-                <w:sz w:val="18"/>
-                <w:szCs w:val="18"/>
+                <w:sz w:val="20"/>
+                <w:szCs w:val="20"/>
               </w:rPr>
               <w:br/>
               <w:t xml:space="preserve">   </w:t>
@@ -2518,8 +2531,8 @@
               <w:rPr>
                 <w:rFonts w:ascii="Courier New" w:hAnsi="Courier New" w:cs="Courier New"/>
                 <w:color w:val="941EDF"/>
-                <w:sz w:val="18"/>
-                <w:szCs w:val="18"/>
+                <w:sz w:val="20"/>
+                <w:szCs w:val="20"/>
               </w:rPr>
               <w:t>public</w:t>
             </w:r>
@@ -2527,8 +2540,8 @@
               <w:rPr>
                 <w:rFonts w:ascii="Courier New" w:hAnsi="Courier New" w:cs="Courier New"/>
                 <w:color w:val="000000"/>
-                <w:sz w:val="18"/>
-                <w:szCs w:val="18"/>
+                <w:sz w:val="20"/>
+                <w:szCs w:val="20"/>
               </w:rPr>
               <w:t xml:space="preserve"> </w:t>
             </w:r>
@@ -2536,8 +2549,8 @@
               <w:rPr>
                 <w:rFonts w:ascii="Courier New" w:hAnsi="Courier New" w:cs="Courier New"/>
                 <w:color w:val="941EDF"/>
-                <w:sz w:val="18"/>
-                <w:szCs w:val="18"/>
+                <w:sz w:val="20"/>
+                <w:szCs w:val="20"/>
               </w:rPr>
               <w:t>static</w:t>
             </w:r>
@@ -2545,8 +2558,8 @@
               <w:rPr>
                 <w:rFonts w:ascii="Courier New" w:hAnsi="Courier New" w:cs="Courier New"/>
                 <w:color w:val="000000"/>
-                <w:sz w:val="18"/>
-                <w:szCs w:val="18"/>
+                <w:sz w:val="20"/>
+                <w:szCs w:val="20"/>
               </w:rPr>
               <w:t xml:space="preserve"> </w:t>
             </w:r>
@@ -2554,8 +2567,8 @@
               <w:rPr>
                 <w:rFonts w:ascii="Courier New" w:hAnsi="Courier New" w:cs="Courier New"/>
                 <w:color w:val="941EDF"/>
-                <w:sz w:val="18"/>
-                <w:szCs w:val="18"/>
+                <w:sz w:val="20"/>
+                <w:szCs w:val="20"/>
               </w:rPr>
               <w:t>void</w:t>
             </w:r>
@@ -2563,8 +2576,8 @@
               <w:rPr>
                 <w:rFonts w:ascii="Courier New" w:hAnsi="Courier New" w:cs="Courier New"/>
                 <w:color w:val="000000"/>
-                <w:sz w:val="18"/>
-                <w:szCs w:val="18"/>
+                <w:sz w:val="20"/>
+                <w:szCs w:val="20"/>
               </w:rPr>
               <w:t xml:space="preserve"> increment(Count c, </w:t>
             </w:r>
@@ -2573,8 +2586,8 @@
               <w:rPr>
                 <w:rFonts w:ascii="Courier New" w:hAnsi="Courier New" w:cs="Courier New"/>
                 <w:color w:val="941EDF"/>
-                <w:sz w:val="18"/>
-                <w:szCs w:val="18"/>
+                <w:sz w:val="20"/>
+                <w:szCs w:val="20"/>
               </w:rPr>
               <w:t>int</w:t>
             </w:r>
@@ -2583,8 +2596,8 @@
               <w:rPr>
                 <w:rFonts w:ascii="Courier New" w:hAnsi="Courier New" w:cs="Courier New"/>
                 <w:color w:val="000000"/>
-                <w:sz w:val="18"/>
-                <w:szCs w:val="18"/>
+                <w:sz w:val="20"/>
+                <w:szCs w:val="20"/>
               </w:rPr>
               <w:t xml:space="preserve"> times){</w:t>
             </w:r>
@@ -2592,8 +2605,8 @@
               <w:rPr>
                 <w:rFonts w:ascii="Courier New" w:hAnsi="Courier New" w:cs="Courier New"/>
                 <w:color w:val="000000"/>
-                <w:sz w:val="18"/>
-                <w:szCs w:val="18"/>
+                <w:sz w:val="20"/>
+                <w:szCs w:val="20"/>
               </w:rPr>
               <w:br/>
               <w:t xml:space="preserve">      </w:t>
@@ -2603,8 +2616,8 @@
               <w:rPr>
                 <w:rFonts w:ascii="Courier New" w:hAnsi="Courier New" w:cs="Courier New"/>
                 <w:color w:val="000000"/>
-                <w:sz w:val="18"/>
-                <w:szCs w:val="18"/>
+                <w:sz w:val="20"/>
+                <w:szCs w:val="20"/>
               </w:rPr>
               <w:t>c.count</w:t>
             </w:r>
@@ -2613,8 +2626,8 @@
               <w:rPr>
                 <w:rFonts w:ascii="Courier New" w:hAnsi="Courier New" w:cs="Courier New"/>
                 <w:color w:val="000000"/>
-                <w:sz w:val="18"/>
-                <w:szCs w:val="18"/>
+                <w:sz w:val="20"/>
+                <w:szCs w:val="20"/>
               </w:rPr>
               <w:t>++;</w:t>
             </w:r>
@@ -2622,8 +2635,8 @@
               <w:rPr>
                 <w:rFonts w:ascii="Courier New" w:hAnsi="Courier New" w:cs="Courier New"/>
                 <w:color w:val="000000"/>
-                <w:sz w:val="18"/>
-                <w:szCs w:val="18"/>
+                <w:sz w:val="20"/>
+                <w:szCs w:val="20"/>
               </w:rPr>
               <w:br/>
               <w:t xml:space="preserve">      times++;</w:t>
@@ -2632,8 +2645,8 @@
               <w:rPr>
                 <w:rFonts w:ascii="Courier New" w:hAnsi="Courier New" w:cs="Courier New"/>
                 <w:color w:val="000000"/>
-                <w:sz w:val="18"/>
-                <w:szCs w:val="18"/>
+                <w:sz w:val="20"/>
+                <w:szCs w:val="20"/>
               </w:rPr>
               <w:br/>
               <w:t xml:space="preserve">   }</w:t>
@@ -2642,8 +2655,8 @@
               <w:rPr>
                 <w:rFonts w:ascii="Courier New" w:hAnsi="Courier New" w:cs="Courier New"/>
                 <w:color w:val="000000"/>
-                <w:sz w:val="18"/>
-                <w:szCs w:val="18"/>
+                <w:sz w:val="20"/>
+                <w:szCs w:val="20"/>
               </w:rPr>
               <w:br/>
               <w:t>}</w:t>
@@ -2652,8 +2665,8 @@
               <w:rPr>
                 <w:rFonts w:ascii="Courier New" w:hAnsi="Courier New" w:cs="Courier New"/>
                 <w:color w:val="000000"/>
-                <w:sz w:val="18"/>
-                <w:szCs w:val="18"/>
+                <w:sz w:val="20"/>
+                <w:szCs w:val="20"/>
               </w:rPr>
               <w:br/>
             </w:r>
@@ -2663,8 +2676,8 @@
                 <w:i/>
                 <w:iCs/>
                 <w:color w:val="D9D9D9" w:themeColor="background1" w:themeShade="D9"/>
-                <w:sz w:val="18"/>
-                <w:szCs w:val="18"/>
+                <w:sz w:val="20"/>
+                <w:szCs w:val="20"/>
               </w:rPr>
               <w:t>public</w:t>
             </w:r>
@@ -2672,8 +2685,8 @@
               <w:rPr>
                 <w:rFonts w:ascii="Courier New" w:hAnsi="Courier New" w:cs="Courier New"/>
                 <w:color w:val="D9D9D9" w:themeColor="background1" w:themeShade="D9"/>
-                <w:sz w:val="18"/>
-                <w:szCs w:val="18"/>
+                <w:sz w:val="20"/>
+                <w:szCs w:val="20"/>
               </w:rPr>
               <w:t xml:space="preserve"> </w:t>
             </w:r>
@@ -2681,8 +2694,8 @@
               <w:rPr>
                 <w:rFonts w:ascii="Courier New" w:hAnsi="Courier New" w:cs="Courier New"/>
                 <w:color w:val="941EDF"/>
-                <w:sz w:val="18"/>
-                <w:szCs w:val="18"/>
+                <w:sz w:val="20"/>
+                <w:szCs w:val="20"/>
               </w:rPr>
               <w:t>class</w:t>
             </w:r>
@@ -2690,8 +2703,8 @@
               <w:rPr>
                 <w:rFonts w:ascii="Courier New" w:hAnsi="Courier New" w:cs="Courier New"/>
                 <w:color w:val="000000"/>
-                <w:sz w:val="18"/>
-                <w:szCs w:val="18"/>
+                <w:sz w:val="20"/>
+                <w:szCs w:val="20"/>
               </w:rPr>
               <w:t xml:space="preserve"> Count{</w:t>
             </w:r>
@@ -2699,8 +2712,8 @@
               <w:rPr>
                 <w:rFonts w:ascii="Courier New" w:hAnsi="Courier New" w:cs="Courier New"/>
                 <w:color w:val="000000"/>
-                <w:sz w:val="18"/>
-                <w:szCs w:val="18"/>
+                <w:sz w:val="20"/>
+                <w:szCs w:val="20"/>
               </w:rPr>
               <w:br/>
               <w:t xml:space="preserve">   </w:t>
@@ -2709,8 +2722,8 @@
               <w:rPr>
                 <w:rFonts w:ascii="Courier New" w:hAnsi="Courier New" w:cs="Courier New"/>
                 <w:color w:val="941EDF"/>
-                <w:sz w:val="18"/>
-                <w:szCs w:val="18"/>
+                <w:sz w:val="20"/>
+                <w:szCs w:val="20"/>
               </w:rPr>
               <w:t>public</w:t>
             </w:r>
@@ -2718,8 +2731,8 @@
               <w:rPr>
                 <w:rFonts w:ascii="Courier New" w:hAnsi="Courier New" w:cs="Courier New"/>
                 <w:color w:val="000000"/>
-                <w:sz w:val="18"/>
-                <w:szCs w:val="18"/>
+                <w:sz w:val="20"/>
+                <w:szCs w:val="20"/>
               </w:rPr>
               <w:t xml:space="preserve"> </w:t>
             </w:r>
@@ -2728,8 +2741,8 @@
               <w:rPr>
                 <w:rFonts w:ascii="Courier New" w:hAnsi="Courier New" w:cs="Courier New"/>
                 <w:color w:val="941EDF"/>
-                <w:sz w:val="18"/>
-                <w:szCs w:val="18"/>
+                <w:sz w:val="20"/>
+                <w:szCs w:val="20"/>
               </w:rPr>
               <w:t>int</w:t>
             </w:r>
@@ -2738,8 +2751,8 @@
               <w:rPr>
                 <w:rFonts w:ascii="Courier New" w:hAnsi="Courier New" w:cs="Courier New"/>
                 <w:color w:val="000000"/>
-                <w:sz w:val="18"/>
-                <w:szCs w:val="18"/>
+                <w:sz w:val="20"/>
+                <w:szCs w:val="20"/>
               </w:rPr>
               <w:t xml:space="preserve"> count;</w:t>
             </w:r>
@@ -2747,8 +2760,8 @@
               <w:rPr>
                 <w:rFonts w:ascii="Courier New" w:hAnsi="Courier New" w:cs="Courier New"/>
                 <w:color w:val="000000"/>
-                <w:sz w:val="18"/>
-                <w:szCs w:val="18"/>
+                <w:sz w:val="20"/>
+                <w:szCs w:val="20"/>
               </w:rPr>
               <w:br/>
               <w:t xml:space="preserve">   </w:t>
@@ -2757,8 +2770,8 @@
               <w:rPr>
                 <w:rFonts w:ascii="Courier New" w:hAnsi="Courier New" w:cs="Courier New"/>
                 <w:color w:val="000000"/>
-                <w:sz w:val="18"/>
-                <w:szCs w:val="18"/>
+                <w:sz w:val="20"/>
+                <w:szCs w:val="20"/>
               </w:rPr>
               <w:br/>
               <w:t xml:space="preserve">   </w:t>
@@ -2767,8 +2780,8 @@
               <w:rPr>
                 <w:rFonts w:ascii="Courier New" w:hAnsi="Courier New" w:cs="Courier New"/>
                 <w:color w:val="941EDF"/>
-                <w:sz w:val="18"/>
-                <w:szCs w:val="18"/>
+                <w:sz w:val="20"/>
+                <w:szCs w:val="20"/>
               </w:rPr>
               <w:t>public</w:t>
             </w:r>
@@ -2776,8 +2789,8 @@
               <w:rPr>
                 <w:rFonts w:ascii="Courier New" w:hAnsi="Courier New" w:cs="Courier New"/>
                 <w:color w:val="000000"/>
-                <w:sz w:val="18"/>
-                <w:szCs w:val="18"/>
+                <w:sz w:val="20"/>
+                <w:szCs w:val="20"/>
               </w:rPr>
               <w:t xml:space="preserve"> Count(</w:t>
             </w:r>
@@ -2786,8 +2799,8 @@
               <w:rPr>
                 <w:rFonts w:ascii="Courier New" w:hAnsi="Courier New" w:cs="Courier New"/>
                 <w:color w:val="941EDF"/>
-                <w:sz w:val="18"/>
-                <w:szCs w:val="18"/>
+                <w:sz w:val="20"/>
+                <w:szCs w:val="20"/>
               </w:rPr>
               <w:t>int</w:t>
             </w:r>
@@ -2796,8 +2809,8 @@
               <w:rPr>
                 <w:rFonts w:ascii="Courier New" w:hAnsi="Courier New" w:cs="Courier New"/>
                 <w:color w:val="000000"/>
-                <w:sz w:val="18"/>
-                <w:szCs w:val="18"/>
+                <w:sz w:val="20"/>
+                <w:szCs w:val="20"/>
               </w:rPr>
               <w:t xml:space="preserve"> c){</w:t>
             </w:r>
@@ -2805,8 +2818,8 @@
               <w:rPr>
                 <w:rFonts w:ascii="Courier New" w:hAnsi="Courier New" w:cs="Courier New"/>
                 <w:color w:val="000000"/>
-                <w:sz w:val="18"/>
-                <w:szCs w:val="18"/>
+                <w:sz w:val="20"/>
+                <w:szCs w:val="20"/>
               </w:rPr>
               <w:br/>
               <w:t xml:space="preserve">     count =c;</w:t>
@@ -2815,8 +2828,8 @@
               <w:rPr>
                 <w:rFonts w:ascii="Courier New" w:hAnsi="Courier New" w:cs="Courier New"/>
                 <w:color w:val="000000"/>
-                <w:sz w:val="18"/>
-                <w:szCs w:val="18"/>
+                <w:sz w:val="20"/>
+                <w:szCs w:val="20"/>
               </w:rPr>
               <w:br/>
               <w:t xml:space="preserve">   }</w:t>
@@ -2825,8 +2838,8 @@
               <w:rPr>
                 <w:rFonts w:ascii="Courier New" w:hAnsi="Courier New" w:cs="Courier New"/>
                 <w:color w:val="000000"/>
-                <w:sz w:val="18"/>
-                <w:szCs w:val="18"/>
+                <w:sz w:val="20"/>
+                <w:szCs w:val="20"/>
               </w:rPr>
               <w:br/>
               <w:t xml:space="preserve">   </w:t>
@@ -2835,8 +2848,8 @@
               <w:rPr>
                 <w:rFonts w:ascii="Courier New" w:hAnsi="Courier New" w:cs="Courier New"/>
                 <w:color w:val="941EDF"/>
-                <w:sz w:val="18"/>
-                <w:szCs w:val="18"/>
+                <w:sz w:val="20"/>
+                <w:szCs w:val="20"/>
               </w:rPr>
               <w:t>public</w:t>
             </w:r>
@@ -2844,8 +2857,8 @@
               <w:rPr>
                 <w:rFonts w:ascii="Courier New" w:hAnsi="Courier New" w:cs="Courier New"/>
                 <w:color w:val="000000"/>
-                <w:sz w:val="18"/>
-                <w:szCs w:val="18"/>
+                <w:sz w:val="20"/>
+                <w:szCs w:val="20"/>
               </w:rPr>
               <w:t xml:space="preserve"> Count(){</w:t>
             </w:r>
@@ -2853,8 +2866,8 @@
               <w:rPr>
                 <w:rFonts w:ascii="Courier New" w:hAnsi="Courier New" w:cs="Courier New"/>
                 <w:color w:val="000000"/>
-                <w:sz w:val="18"/>
-                <w:szCs w:val="18"/>
+                <w:sz w:val="20"/>
+                <w:szCs w:val="20"/>
               </w:rPr>
               <w:br/>
               <w:t xml:space="preserve">     count =1;</w:t>
@@ -2863,8 +2876,8 @@
               <w:rPr>
                 <w:rFonts w:ascii="Courier New" w:hAnsi="Courier New" w:cs="Courier New"/>
                 <w:color w:val="000000"/>
-                <w:sz w:val="18"/>
-                <w:szCs w:val="18"/>
+                <w:sz w:val="20"/>
+                <w:szCs w:val="20"/>
               </w:rPr>
               <w:br/>
               <w:t xml:space="preserve">   } </w:t>
@@ -2873,8 +2886,8 @@
               <w:rPr>
                 <w:rFonts w:ascii="Courier New" w:hAnsi="Courier New" w:cs="Courier New"/>
                 <w:color w:val="000000"/>
-                <w:sz w:val="18"/>
-                <w:szCs w:val="18"/>
+                <w:sz w:val="20"/>
+                <w:szCs w:val="20"/>
               </w:rPr>
               <w:br/>
               <w:t>}</w:t>
@@ -2891,16 +2904,16 @@
               <w:rPr>
                 <w:rFonts w:ascii="Courier New" w:hAnsi="Courier New" w:cs="Courier New"/>
                 <w:color w:val="1F3864" w:themeColor="accent5" w:themeShade="80"/>
-                <w:sz w:val="18"/>
-                <w:szCs w:val="18"/>
+                <w:sz w:val="20"/>
+                <w:szCs w:val="20"/>
               </w:rPr>
             </w:pPr>
             <w:r>
               <w:rPr>
                 <w:rFonts w:ascii="Courier New" w:hAnsi="Courier New" w:cs="Courier New"/>
                 <w:color w:val="1F3864" w:themeColor="accent5" w:themeShade="80"/>
-                <w:sz w:val="18"/>
-                <w:szCs w:val="18"/>
+                <w:sz w:val="20"/>
+                <w:szCs w:val="20"/>
               </w:rPr>
               <w:t>count is 101</w:t>
             </w:r>
@@ -2910,16 +2923,16 @@
               <w:rPr>
                 <w:rFonts w:ascii="Courier New" w:hAnsi="Courier New" w:cs="Courier New"/>
                 <w:color w:val="1F3864" w:themeColor="accent5" w:themeShade="80"/>
-                <w:sz w:val="18"/>
-                <w:szCs w:val="18"/>
+                <w:sz w:val="20"/>
+                <w:szCs w:val="20"/>
               </w:rPr>
             </w:pPr>
             <w:r>
               <w:rPr>
                 <w:rFonts w:ascii="Courier New" w:hAnsi="Courier New" w:cs="Courier New"/>
                 <w:color w:val="1F3864" w:themeColor="accent5" w:themeShade="80"/>
-                <w:sz w:val="18"/>
-                <w:szCs w:val="18"/>
+                <w:sz w:val="20"/>
+                <w:szCs w:val="20"/>
               </w:rPr>
               <w:t>times is 0</w:t>
             </w:r>
@@ -2929,7 +2942,8 @@
               <w:rPr>
                 <w:rFonts w:ascii="TH Sarabun New" w:hAnsi="TH Sarabun New" w:cs="TH Sarabun New"/>
                 <w:color w:val="00002D"/>
-                <w:szCs w:val="24"/>
+                <w:sz w:val="20"/>
+                <w:szCs w:val="20"/>
                 <w:cs/>
                 <w:lang w:val="en-GB" w:eastAsia="ja-JP"/>
               </w:rPr>
@@ -3871,7 +3885,6 @@
                 <w:szCs w:val="18"/>
               </w:rPr>
             </w:pPr>
-            <w:bookmarkStart w:id="0" w:name="_GoBack" w:colFirst="1" w:colLast="1"/>
             <w:r>
               <w:rPr>
                 <w:rFonts w:ascii="Courier New" w:hAnsi="Courier New" w:cs="Courier New"/>
@@ -4527,16 +4540,16 @@
               <w:rPr>
                 <w:rFonts w:ascii="Courier New" w:hAnsi="Courier New" w:cs="Courier New"/>
                 <w:color w:val="1F3864" w:themeColor="accent5" w:themeShade="80"/>
-                <w:sz w:val="18"/>
-                <w:szCs w:val="18"/>
+                <w:sz w:val="20"/>
+                <w:szCs w:val="20"/>
               </w:rPr>
             </w:pPr>
             <w:r>
               <w:rPr>
                 <w:rFonts w:ascii="Courier New" w:hAnsi="Courier New" w:cs="Courier New"/>
                 <w:color w:val="1F3864" w:themeColor="accent5" w:themeShade="80"/>
-                <w:sz w:val="18"/>
-                <w:szCs w:val="18"/>
+                <w:sz w:val="20"/>
+                <w:szCs w:val="20"/>
               </w:rPr>
               <w:t>a[0] = 1 a[1] = 2</w:t>
             </w:r>
@@ -5539,16 +5552,16 @@
               <w:rPr>
                 <w:rFonts w:ascii="Courier New" w:hAnsi="Courier New" w:cs="Courier New"/>
                 <w:color w:val="1F3864" w:themeColor="accent5" w:themeShade="80"/>
-                <w:sz w:val="18"/>
-                <w:szCs w:val="18"/>
+                <w:sz w:val="20"/>
+                <w:szCs w:val="20"/>
               </w:rPr>
             </w:pPr>
             <w:r>
               <w:rPr>
                 <w:rFonts w:ascii="Courier New" w:hAnsi="Courier New" w:cs="Courier New"/>
                 <w:color w:val="1F3864" w:themeColor="accent5" w:themeShade="80"/>
-                <w:sz w:val="18"/>
-                <w:szCs w:val="18"/>
+                <w:sz w:val="20"/>
+                <w:szCs w:val="20"/>
               </w:rPr>
               <w:t xml:space="preserve">t1's </w:t>
             </w:r>
@@ -5557,8 +5570,8 @@
               <w:rPr>
                 <w:rFonts w:ascii="Courier New" w:hAnsi="Courier New" w:cs="Courier New"/>
                 <w:color w:val="1F3864" w:themeColor="accent5" w:themeShade="80"/>
-                <w:sz w:val="18"/>
-                <w:szCs w:val="18"/>
+                <w:sz w:val="20"/>
+                <w:szCs w:val="20"/>
               </w:rPr>
               <w:t>i</w:t>
             </w:r>
@@ -5567,8 +5580,8 @@
               <w:rPr>
                 <w:rFonts w:ascii="Courier New" w:hAnsi="Courier New" w:cs="Courier New"/>
                 <w:color w:val="1F3864" w:themeColor="accent5" w:themeShade="80"/>
-                <w:sz w:val="18"/>
-                <w:szCs w:val="18"/>
+                <w:sz w:val="20"/>
+                <w:szCs w:val="20"/>
               </w:rPr>
               <w:t xml:space="preserve"> = 2 and j = 1</w:t>
             </w:r>
@@ -5578,16 +5591,16 @@
               <w:rPr>
                 <w:rFonts w:ascii="Courier New" w:hAnsi="Courier New" w:cs="Courier New"/>
                 <w:color w:val="1F3864" w:themeColor="accent5" w:themeShade="80"/>
-                <w:sz w:val="18"/>
-                <w:szCs w:val="18"/>
+                <w:sz w:val="20"/>
+                <w:szCs w:val="20"/>
               </w:rPr>
             </w:pPr>
             <w:r>
               <w:rPr>
                 <w:rFonts w:ascii="Courier New" w:hAnsi="Courier New" w:cs="Courier New"/>
                 <w:color w:val="1F3864" w:themeColor="accent5" w:themeShade="80"/>
-                <w:sz w:val="18"/>
-                <w:szCs w:val="18"/>
+                <w:sz w:val="20"/>
+                <w:szCs w:val="20"/>
               </w:rPr>
               <w:t xml:space="preserve">t2's </w:t>
             </w:r>
@@ -5596,8 +5609,8 @@
               <w:rPr>
                 <w:rFonts w:ascii="Courier New" w:hAnsi="Courier New" w:cs="Courier New"/>
                 <w:color w:val="1F3864" w:themeColor="accent5" w:themeShade="80"/>
-                <w:sz w:val="18"/>
-                <w:szCs w:val="18"/>
+                <w:sz w:val="20"/>
+                <w:szCs w:val="20"/>
               </w:rPr>
               <w:t>i</w:t>
             </w:r>
@@ -5606,15 +5619,14 @@
               <w:rPr>
                 <w:rFonts w:ascii="Courier New" w:hAnsi="Courier New" w:cs="Courier New"/>
                 <w:color w:val="1F3864" w:themeColor="accent5" w:themeShade="80"/>
-                <w:sz w:val="18"/>
-                <w:szCs w:val="18"/>
+                <w:sz w:val="20"/>
+                <w:szCs w:val="20"/>
               </w:rPr>
               <w:t xml:space="preserve"> = 2 and j = 1</w:t>
             </w:r>
           </w:p>
         </w:tc>
       </w:tr>
-      <w:bookmarkEnd w:id="0"/>
     </w:tbl>
     <w:p>
       <w:pPr>
@@ -6605,22 +6617,146 @@
       </w:pPr>
       <w:r>
         <w:rPr>
+          <w:rFonts w:ascii="TH SarabunPSK" w:hAnsi="TH SarabunPSK" w:cs="TH SarabunPSK"/>
+          <w:sz w:val="28"/>
+        </w:rPr>
+        <w:t xml:space="preserve">Draw the UML diagram for the class and then implement the class. Write a test program that creates three </w:t>
+      </w:r>
+      <w:proofErr w:type="spellStart"/>
+      <w:r>
+        <w:rPr>
+          <w:rFonts w:ascii="Courier New" w:hAnsi="Courier New" w:cs="Courier New"/>
+          <w:b/>
+          <w:bCs/>
+          <w:color w:val="00B0F0"/>
+          <w:szCs w:val="24"/>
+        </w:rPr>
+        <w:t>RegularPolygon</w:t>
+      </w:r>
+      <w:proofErr w:type="spellEnd"/>
+      <w:r>
+        <w:rPr>
+          <w:rFonts w:ascii="TH SarabunPSK" w:hAnsi="TH SarabunPSK" w:cs="TH SarabunPSK"/>
+          <w:sz w:val="28"/>
+        </w:rPr>
+        <w:t xml:space="preserve"> objects, created using the no-</w:t>
+      </w:r>
+      <w:proofErr w:type="spellStart"/>
+      <w:r>
+        <w:rPr>
+          <w:rFonts w:ascii="TH SarabunPSK" w:hAnsi="TH SarabunPSK" w:cs="TH SarabunPSK"/>
+          <w:sz w:val="28"/>
+        </w:rPr>
+        <w:t>arg</w:t>
+      </w:r>
+      <w:proofErr w:type="spellEnd"/>
+      <w:r>
+        <w:rPr>
+          <w:rFonts w:ascii="TH SarabunPSK" w:hAnsi="TH SarabunPSK" w:cs="TH SarabunPSK"/>
+          <w:sz w:val="28"/>
+        </w:rPr>
+        <w:t xml:space="preserve"> constructor, using </w:t>
+      </w:r>
+      <w:proofErr w:type="spellStart"/>
+      <w:proofErr w:type="gramStart"/>
+      <w:r>
+        <w:rPr>
+          <w:rFonts w:ascii="Courier New" w:hAnsi="Courier New" w:cs="Courier New"/>
+          <w:b/>
+          <w:bCs/>
+          <w:color w:val="00B0F0"/>
+          <w:szCs w:val="24"/>
+        </w:rPr>
+        <w:t>RegularPolygon</w:t>
+      </w:r>
+      <w:proofErr w:type="spellEnd"/>
+      <w:r>
+        <w:rPr>
+          <w:rFonts w:ascii="Courier New" w:hAnsi="Courier New" w:cs="Courier New"/>
+          <w:b/>
+          <w:bCs/>
+          <w:color w:val="00B0F0"/>
+          <w:szCs w:val="24"/>
+        </w:rPr>
+        <w:t>(</w:t>
+      </w:r>
+      <w:proofErr w:type="gramEnd"/>
+      <w:r>
+        <w:rPr>
+          <w:rFonts w:ascii="Courier New" w:hAnsi="Courier New" w:cs="Courier New"/>
+          <w:b/>
+          <w:bCs/>
+          <w:color w:val="00B0F0"/>
+          <w:szCs w:val="24"/>
+        </w:rPr>
+        <w:t>6, 4)</w:t>
+      </w:r>
+      <w:r>
+        <w:rPr>
+          <w:rFonts w:ascii="TH SarabunPSK" w:hAnsi="TH SarabunPSK" w:cs="TH SarabunPSK"/>
+          <w:sz w:val="28"/>
+        </w:rPr>
+        <w:t xml:space="preserve">, and using </w:t>
+      </w:r>
+      <w:proofErr w:type="spellStart"/>
+      <w:r>
+        <w:rPr>
+          <w:rFonts w:ascii="Courier New" w:hAnsi="Courier New" w:cs="Courier New"/>
+          <w:b/>
+          <w:bCs/>
+          <w:color w:val="00B0F0"/>
+          <w:szCs w:val="24"/>
+        </w:rPr>
+        <w:t>RegularPolygon</w:t>
+      </w:r>
+      <w:proofErr w:type="spellEnd"/>
+      <w:r>
+        <w:rPr>
+          <w:rFonts w:ascii="Courier New" w:hAnsi="Courier New" w:cs="Courier New"/>
+          <w:b/>
+          <w:bCs/>
+          <w:color w:val="00B0F0"/>
+          <w:szCs w:val="24"/>
+        </w:rPr>
+        <w:t>(10, 4, 5.6, 7.8)</w:t>
+      </w:r>
+      <w:r>
+        <w:rPr>
+          <w:rFonts w:ascii="TH SarabunPSK" w:hAnsi="TH SarabunPSK" w:cs="TH SarabunPSK"/>
+          <w:sz w:val="28"/>
+        </w:rPr>
+        <w:t>. For each object, display its perimeter and area.</w:t>
+      </w:r>
+    </w:p>
+    <w:p>
+      <w:pPr>
+        <w:rPr>
+          <w:rFonts w:ascii="TH SarabunPSK" w:hAnsi="TH SarabunPSK" w:cs="TH SarabunPSK"/>
+          <w:sz w:val="28"/>
+        </w:rPr>
+      </w:pPr>
+    </w:p>
+    <w:p>
+      <w:pPr>
+        <w:jc w:val="center"/>
+        <w:rPr>
+          <w:rFonts w:ascii="TH SarabunPSK" w:hAnsi="TH SarabunPSK" w:cs="TH SarabunPSK"/>
+          <w:b/>
+          <w:bCs/>
+          <w:sz w:val="32"/>
+          <w:szCs w:val="32"/>
+        </w:rPr>
+      </w:pPr>
+      <w:r>
+        <w:rPr>
           <w:noProof/>
           <w:lang w:eastAsia="ja-JP"/>
         </w:rPr>
         <w:drawing>
-          <wp:anchor distT="0" distB="0" distL="114300" distR="114300" simplePos="0" relativeHeight="251658240" behindDoc="0" locked="0" layoutInCell="1" allowOverlap="1">
-            <wp:simplePos x="0" y="0"/>
-            <wp:positionH relativeFrom="column">
-              <wp:posOffset>1052195</wp:posOffset>
-            </wp:positionH>
-            <wp:positionV relativeFrom="paragraph">
-              <wp:posOffset>902970</wp:posOffset>
-            </wp:positionV>
-            <wp:extent cx="3858260" cy="2270760"/>
-            <wp:effectExtent l="0" t="0" r="8890" b="0"/>
-            <wp:wrapTopAndBottom/>
-            <wp:docPr id="1" name="Picture 1" descr="problem08"/>
+          <wp:inline distT="0" distB="0" distL="0" distR="0">
+            <wp:extent cx="5929820" cy="2774188"/>
+            <wp:effectExtent l="0" t="0" r="0" b="7620"/>
+            <wp:docPr id="2" name="Picture 2" descr="C:\Users\Administrator\AppData\Local\Microsoft\Windows\INetCache\Content.Word\OOP 1_69 Class Diagrams-w2 p8.drawio.png"/>
             <wp:cNvGraphicFramePr>
               <a:graphicFrameLocks xmlns:a="http://schemas.openxmlformats.org/drawingml/2006/main" noChangeAspect="1"/>
             </wp:cNvGraphicFramePr>
@@ -6628,7 +6764,7 @@
               <a:graphicData uri="http://schemas.openxmlformats.org/drawingml/2006/picture">
                 <pic:pic xmlns:pic="http://schemas.openxmlformats.org/drawingml/2006/picture">
                   <pic:nvPicPr>
-                    <pic:cNvPr id="0" name="Picture 2" descr="problem08"/>
+                    <pic:cNvPr id="0" name="Picture 3" descr="C:\Users\Administrator\AppData\Local\Microsoft\Windows\INetCache\Content.Word\OOP 1_69 Class Diagrams-w2 p8.drawio.png"/>
                     <pic:cNvPicPr>
                       <a:picLocks noChangeAspect="1" noChangeArrowheads="1"/>
                     </pic:cNvPicPr>
@@ -6649,156 +6785,22 @@
                   <pic:spPr bwMode="auto">
                     <a:xfrm>
                       <a:off x="0" y="0"/>
-                      <a:ext cx="3858260" cy="2270760"/>
+                      <a:ext cx="5933164" cy="2775752"/>
                     </a:xfrm>
                     <a:prstGeom prst="rect">
                       <a:avLst/>
                     </a:prstGeom>
                     <a:noFill/>
+                    <a:ln>
+                      <a:noFill/>
+                    </a:ln>
                   </pic:spPr>
                 </pic:pic>
               </a:graphicData>
             </a:graphic>
-            <wp14:sizeRelH relativeFrom="page">
-              <wp14:pctWidth>0</wp14:pctWidth>
-            </wp14:sizeRelH>
-            <wp14:sizeRelV relativeFrom="page">
-              <wp14:pctHeight>0</wp14:pctHeight>
-            </wp14:sizeRelV>
-          </wp:anchor>
+          </wp:inline>
         </w:drawing>
       </w:r>
-      <w:r>
-        <w:rPr>
-          <w:rFonts w:ascii="TH SarabunPSK" w:hAnsi="TH SarabunPSK" w:cs="TH SarabunPSK"/>
-          <w:sz w:val="28"/>
-        </w:rPr>
-        <w:t xml:space="preserve">Draw the UML diagram for the class and then implement the class. Write a test program that creates three </w:t>
-      </w:r>
-      <w:proofErr w:type="spellStart"/>
-      <w:r>
-        <w:rPr>
-          <w:rFonts w:ascii="Courier New" w:hAnsi="Courier New" w:cs="Courier New"/>
-          <w:b/>
-          <w:bCs/>
-          <w:color w:val="00B0F0"/>
-          <w:szCs w:val="24"/>
-        </w:rPr>
-        <w:t>RegularPolygon</w:t>
-      </w:r>
-      <w:proofErr w:type="spellEnd"/>
-      <w:r>
-        <w:rPr>
-          <w:rFonts w:ascii="TH SarabunPSK" w:hAnsi="TH SarabunPSK" w:cs="TH SarabunPSK"/>
-          <w:sz w:val="28"/>
-        </w:rPr>
-        <w:t xml:space="preserve"> objects, created using the no-</w:t>
-      </w:r>
-      <w:proofErr w:type="spellStart"/>
-      <w:r>
-        <w:rPr>
-          <w:rFonts w:ascii="TH SarabunPSK" w:hAnsi="TH SarabunPSK" w:cs="TH SarabunPSK"/>
-          <w:sz w:val="28"/>
-        </w:rPr>
-        <w:t>arg</w:t>
-      </w:r>
-      <w:proofErr w:type="spellEnd"/>
-      <w:r>
-        <w:rPr>
-          <w:rFonts w:ascii="TH SarabunPSK" w:hAnsi="TH SarabunPSK" w:cs="TH SarabunPSK"/>
-          <w:sz w:val="28"/>
-        </w:rPr>
-        <w:t xml:space="preserve"> constructor, using </w:t>
-      </w:r>
-      <w:proofErr w:type="spellStart"/>
-      <w:proofErr w:type="gramStart"/>
-      <w:r>
-        <w:rPr>
-          <w:rFonts w:ascii="Courier New" w:hAnsi="Courier New" w:cs="Courier New"/>
-          <w:b/>
-          <w:bCs/>
-          <w:color w:val="00B0F0"/>
-          <w:szCs w:val="24"/>
-        </w:rPr>
-        <w:t>RegularPolygon</w:t>
-      </w:r>
-      <w:proofErr w:type="spellEnd"/>
-      <w:r>
-        <w:rPr>
-          <w:rFonts w:ascii="Courier New" w:hAnsi="Courier New" w:cs="Courier New"/>
-          <w:b/>
-          <w:bCs/>
-          <w:color w:val="00B0F0"/>
-          <w:szCs w:val="24"/>
-        </w:rPr>
-        <w:t>(</w:t>
-      </w:r>
-      <w:proofErr w:type="gramEnd"/>
-      <w:r>
-        <w:rPr>
-          <w:rFonts w:ascii="Courier New" w:hAnsi="Courier New" w:cs="Courier New"/>
-          <w:b/>
-          <w:bCs/>
-          <w:color w:val="00B0F0"/>
-          <w:szCs w:val="24"/>
-        </w:rPr>
-        <w:t>6, 4)</w:t>
-      </w:r>
-      <w:r>
-        <w:rPr>
-          <w:rFonts w:ascii="TH SarabunPSK" w:hAnsi="TH SarabunPSK" w:cs="TH SarabunPSK"/>
-          <w:sz w:val="28"/>
-        </w:rPr>
-        <w:t xml:space="preserve">, and using </w:t>
-      </w:r>
-      <w:proofErr w:type="spellStart"/>
-      <w:r>
-        <w:rPr>
-          <w:rFonts w:ascii="Courier New" w:hAnsi="Courier New" w:cs="Courier New"/>
-          <w:b/>
-          <w:bCs/>
-          <w:color w:val="00B0F0"/>
-          <w:szCs w:val="24"/>
-        </w:rPr>
-        <w:t>RegularPolygon</w:t>
-      </w:r>
-      <w:proofErr w:type="spellEnd"/>
-      <w:r>
-        <w:rPr>
-          <w:rFonts w:ascii="Courier New" w:hAnsi="Courier New" w:cs="Courier New"/>
-          <w:b/>
-          <w:bCs/>
-          <w:color w:val="00B0F0"/>
-          <w:szCs w:val="24"/>
-        </w:rPr>
-        <w:t>(10, 4, 5.6, 7.8)</w:t>
-      </w:r>
-      <w:r>
-        <w:rPr>
-          <w:rFonts w:ascii="TH SarabunPSK" w:hAnsi="TH SarabunPSK" w:cs="TH SarabunPSK"/>
-          <w:sz w:val="28"/>
-        </w:rPr>
-        <w:t>. For each object, display its perimeter and area.</w:t>
-      </w:r>
-    </w:p>
-    <w:p>
-      <w:pPr>
-        <w:rPr>
-          <w:rFonts w:ascii="TH SarabunPSK" w:hAnsi="TH SarabunPSK" w:cs="TH SarabunPSK"/>
-          <w:sz w:val="28"/>
-        </w:rPr>
-      </w:pPr>
-    </w:p>
-    <w:p>
-      <w:pPr>
-        <w:rPr>
-          <w:rFonts w:ascii="TH SarabunPSK" w:hAnsi="TH SarabunPSK" w:cs="TH SarabunPSK"/>
-          <w:b/>
-          <w:bCs/>
-          <w:sz w:val="32"/>
-          <w:szCs w:val="32"/>
-        </w:rPr>
-      </w:pPr>
     </w:p>
     <w:p/>
     <w:sectPr>

</xml_diff>